<commit_message>
docs: align the report with the MPT template and add the GitHub link
</commit_message>
<xml_diff>
--- a/docs/Otchet_PR1.docx
+++ b/docs/Otchet_PR1.docx
@@ -4,7 +4,7 @@
   <w:body>
     <w:p>
       <w:pPr>
-        <w:spacing w:after="80" w:line="276" w:lineRule="auto"/>
+        <w:spacing w:after="0" w:before="0" w:line="240" w:lineRule="auto"/>
         <w:jc w:val="center"/>
       </w:pPr>
       <w:r>
@@ -12,14 +12,14 @@
           <w:rFonts w:ascii="Times New Roman" w:hAnsi="Times New Roman" w:eastAsia="Times New Roman"/>
           <w:b/>
           <w:i w:val="0"/>
-          <w:sz w:val="26"/>
+          <w:sz w:val="28"/>
         </w:rPr>
-        <w:t>ДЕПАРТАМЕНТ ОБРАЗОВАНИЯ И НАУКИ ГОРОДА МОСКВЫ</w:t>
+        <w:t>Министерство науки и высшего образования Российской Федерации</w:t>
       </w:r>
     </w:p>
     <w:p>
       <w:pPr>
-        <w:spacing w:after="0" w:line="276" w:lineRule="auto"/>
+        <w:spacing w:after="0" w:before="0" w:line="240" w:lineRule="auto"/>
         <w:jc w:val="center"/>
       </w:pPr>
       <w:r>
@@ -29,12 +29,12 @@
           <w:i w:val="0"/>
           <w:sz w:val="26"/>
         </w:rPr>
-        <w:t>Государственное бюджетное профессиональное образовательное учреждение</w:t>
+        <w:t>федеральное государственное бюджетное образовательное учреждение высшего образования</w:t>
       </w:r>
     </w:p>
     <w:p>
       <w:pPr>
-        <w:spacing w:after="480" w:line="276" w:lineRule="auto"/>
+        <w:spacing w:after="0" w:before="0" w:line="240" w:lineRule="auto"/>
         <w:jc w:val="center"/>
       </w:pPr>
       <w:r>
@@ -42,14 +42,14 @@
           <w:rFonts w:ascii="Times New Roman" w:hAnsi="Times New Roman" w:eastAsia="Times New Roman"/>
           <w:b/>
           <w:i w:val="0"/>
-          <w:sz w:val="26"/>
+          <w:sz w:val="28"/>
         </w:rPr>
-        <w:t>города Москвы «Московский приборостроительный техникум»</w:t>
+        <w:t>«Российский экономический университет имени Г.В. Плеханова»</w:t>
       </w:r>
     </w:p>
     <w:p>
       <w:pPr>
-        <w:spacing w:after="120" w:line="276" w:lineRule="auto"/>
+        <w:spacing w:after="0" w:before="0" w:line="240" w:lineRule="auto"/>
         <w:jc w:val="center"/>
       </w:pPr>
       <w:r>
@@ -57,14 +57,44 @@
           <w:rFonts w:ascii="Times New Roman" w:hAnsi="Times New Roman" w:eastAsia="Times New Roman"/>
           <w:b/>
           <w:i w:val="0"/>
-          <w:sz w:val="44"/>
+          <w:sz w:val="28"/>
         </w:rPr>
-        <w:t>ОТЧЁТ</w:t>
+        <w:t>Московский приборостроительный техникум</w:t>
       </w:r>
     </w:p>
     <w:p>
       <w:pPr>
-        <w:spacing w:after="160" w:line="276" w:lineRule="auto"/>
+        <w:spacing w:after="0" w:before="0" w:line="240" w:lineRule="auto"/>
+        <w:jc w:val="center"/>
+      </w:pPr>
+    </w:p>
+    <w:p>
+      <w:pPr>
+        <w:spacing w:after="0" w:before="0" w:line="240" w:lineRule="auto"/>
+        <w:jc w:val="center"/>
+      </w:pPr>
+    </w:p>
+    <w:p>
+      <w:pPr>
+        <w:spacing w:after="0" w:before="0" w:line="240" w:lineRule="auto"/>
+        <w:jc w:val="center"/>
+      </w:pPr>
+    </w:p>
+    <w:p>
+      <w:pPr>
+        <w:spacing w:after="0" w:before="0" w:line="240" w:lineRule="auto"/>
+        <w:jc w:val="center"/>
+      </w:pPr>
+    </w:p>
+    <w:p>
+      <w:pPr>
+        <w:spacing w:after="0" w:before="0" w:line="240" w:lineRule="auto"/>
+        <w:jc w:val="center"/>
+      </w:pPr>
+    </w:p>
+    <w:p>
+      <w:pPr>
+        <w:spacing w:after="0" w:before="0" w:line="240" w:lineRule="auto"/>
         <w:jc w:val="center"/>
       </w:pPr>
       <w:r>
@@ -74,12 +104,259 @@
           <w:i w:val="0"/>
           <w:sz w:val="32"/>
         </w:rPr>
-        <w:t>по практической работе № 1</w:t>
+        <w:t>Практические работы по дисциплине</w:t>
       </w:r>
     </w:p>
     <w:p>
       <w:pPr>
-        <w:spacing w:after="160" w:line="276" w:lineRule="auto"/>
+        <w:spacing w:after="0" w:before="0" w:line="240" w:lineRule="auto"/>
+        <w:jc w:val="center"/>
+      </w:pPr>
+      <w:r>
+        <w:rPr>
+          <w:rFonts w:ascii="Times New Roman" w:hAnsi="Times New Roman" w:eastAsia="Times New Roman"/>
+          <w:b/>
+          <w:i w:val="0"/>
+          <w:sz w:val="32"/>
+        </w:rPr>
+        <w:t>МДК 01.03 Разработка мобильных приложений</w:t>
+      </w:r>
+    </w:p>
+    <w:p>
+      <w:pPr>
+        <w:spacing w:after="0" w:before="0" w:line="240" w:lineRule="auto"/>
+        <w:jc w:val="center"/>
+      </w:pPr>
+    </w:p>
+    <w:p>
+      <w:pPr>
+        <w:spacing w:after="0" w:before="0" w:line="240" w:lineRule="auto"/>
+        <w:jc w:val="center"/>
+      </w:pPr>
+    </w:p>
+    <w:p>
+      <w:pPr>
+        <w:spacing w:after="0" w:before="0" w:line="240" w:lineRule="auto"/>
+        <w:jc w:val="center"/>
+      </w:pPr>
+      <w:r>
+        <w:rPr>
+          <w:rFonts w:ascii="Times New Roman" w:hAnsi="Times New Roman" w:eastAsia="Times New Roman"/>
+          <w:b w:val="0"/>
+          <w:i w:val="0"/>
+          <w:sz w:val="28"/>
+        </w:rPr>
+        <w:t>Специальность: 09.02.07 Информационные системы и программирование</w:t>
+      </w:r>
+    </w:p>
+    <w:p>
+      <w:pPr>
+        <w:spacing w:after="0" w:before="0" w:line="240" w:lineRule="auto"/>
+        <w:jc w:val="center"/>
+      </w:pPr>
+    </w:p>
+    <w:p>
+      <w:pPr>
+        <w:spacing w:after="0" w:before="0" w:line="240" w:lineRule="auto"/>
+        <w:jc w:val="center"/>
+      </w:pPr>
+    </w:p>
+    <w:p>
+      <w:pPr>
+        <w:spacing w:after="0" w:before="0" w:line="240" w:lineRule="auto"/>
+        <w:jc w:val="center"/>
+      </w:pPr>
+    </w:p>
+    <w:p>
+      <w:pPr>
+        <w:spacing w:after="0" w:before="0" w:line="240" w:lineRule="auto"/>
+        <w:jc w:val="center"/>
+      </w:pPr>
+    </w:p>
+    <w:p>
+      <w:pPr>
+        <w:spacing w:after="0" w:before="0" w:line="240" w:lineRule="auto"/>
+        <w:jc w:val="center"/>
+      </w:pPr>
+    </w:p>
+    <w:p>
+      <w:pPr>
+        <w:spacing w:after="0" w:before="0" w:line="240" w:lineRule="auto"/>
+        <w:jc w:val="center"/>
+      </w:pPr>
+    </w:p>
+    <w:tbl>
+      <w:tblPr>
+        <w:tblW w:type="auto" w:w="0"/>
+        <w:jc w:val="center"/>
+        <w:tblLook w:firstColumn="1" w:firstRow="1" w:lastColumn="0" w:lastRow="0" w:noHBand="0" w:noVBand="1" w:val="04A0"/>
+        <w:tblBorders>
+          <w:top w:val="nil"/>
+          <w:left w:val="nil"/>
+          <w:bottom w:val="nil"/>
+          <w:right w:val="nil"/>
+          <w:insideH w:val="nil"/>
+          <w:insideV w:val="nil"/>
+        </w:tblBorders>
+      </w:tblPr>
+      <w:tblGrid>
+        <w:gridCol w:w="4677"/>
+        <w:gridCol w:w="4677"/>
+      </w:tblGrid>
+      <w:tr>
+        <w:tc>
+          <w:tcPr>
+            <w:tcW w:type="dxa" w:w="4677"/>
+          </w:tcPr>
+          <w:p>
+            <w:pPr>
+              <w:jc w:val="left"/>
+            </w:pPr>
+            <w:r/>
+            <w:r>
+              <w:rPr>
+                <w:rFonts w:ascii="Times New Roman" w:hAnsi="Times New Roman" w:eastAsia="Times New Roman"/>
+                <w:b/>
+                <w:i w:val="0"/>
+                <w:sz w:val="28"/>
+              </w:rPr>
+              <w:t>Преподаватель</w:t>
+            </w:r>
+          </w:p>
+        </w:tc>
+        <w:tc>
+          <w:tcPr>
+            <w:tcW w:type="dxa" w:w="4677"/>
+          </w:tcPr>
+          <w:p>
+            <w:pPr>
+              <w:jc w:val="right"/>
+            </w:pPr>
+            <w:r/>
+            <w:r>
+              <w:rPr>
+                <w:rFonts w:ascii="Times New Roman" w:hAnsi="Times New Roman" w:eastAsia="Times New Roman"/>
+                <w:b/>
+                <w:i w:val="0"/>
+                <w:sz w:val="28"/>
+              </w:rPr>
+              <w:t>Студент группы П50-___-24</w:t>
+            </w:r>
+          </w:p>
+        </w:tc>
+      </w:tr>
+      <w:tr>
+        <w:tc>
+          <w:tcPr>
+            <w:tcW w:type="dxa" w:w="4677"/>
+          </w:tcPr>
+          <w:p>
+            <w:pPr>
+              <w:jc w:val="left"/>
+            </w:pPr>
+            <w:r/>
+            <w:r>
+              <w:rPr>
+                <w:rFonts w:ascii="Times New Roman" w:hAnsi="Times New Roman" w:eastAsia="Times New Roman"/>
+                <w:b w:val="0"/>
+                <w:i w:val="0"/>
+                <w:sz w:val="28"/>
+              </w:rPr>
+              <w:t>Куртева С.А.</w:t>
+            </w:r>
+          </w:p>
+        </w:tc>
+        <w:tc>
+          <w:tcPr>
+            <w:tcW w:type="dxa" w:w="4677"/>
+          </w:tcPr>
+          <w:p>
+            <w:pPr>
+              <w:jc w:val="right"/>
+            </w:pPr>
+            <w:r/>
+            <w:r>
+              <w:rPr>
+                <w:rFonts w:ascii="Times New Roman" w:hAnsi="Times New Roman" w:eastAsia="Times New Roman"/>
+                <w:b w:val="0"/>
+                <w:i w:val="0"/>
+                <w:sz w:val="28"/>
+              </w:rPr>
+              <w:t>Алескеров И.И.</w:t>
+            </w:r>
+          </w:p>
+        </w:tc>
+      </w:tr>
+      <w:tr>
+        <w:tc>
+          <w:tcPr>
+            <w:tcW w:type="dxa" w:w="4677"/>
+          </w:tcPr>
+          <w:p>
+            <w:pPr>
+              <w:jc w:val="left"/>
+            </w:pPr>
+            <w:r/>
+            <w:r>
+              <w:rPr>
+                <w:rFonts w:ascii="Times New Roman" w:hAnsi="Times New Roman" w:eastAsia="Times New Roman"/>
+                <w:b w:val="0"/>
+                <w:i w:val="0"/>
+                <w:sz w:val="28"/>
+              </w:rPr>
+              <w:t>«___» ________ 2026 год</w:t>
+            </w:r>
+          </w:p>
+        </w:tc>
+        <w:tc>
+          <w:tcPr>
+            <w:tcW w:type="dxa" w:w="4677"/>
+          </w:tcPr>
+          <w:p>
+            <w:pPr>
+              <w:jc w:val="right"/>
+            </w:pPr>
+            <w:r/>
+            <w:r>
+              <w:rPr>
+                <w:rFonts w:ascii="Times New Roman" w:hAnsi="Times New Roman" w:eastAsia="Times New Roman"/>
+                <w:b w:val="0"/>
+                <w:i w:val="0"/>
+                <w:sz w:val="28"/>
+              </w:rPr>
+              <w:t>«____» ________ 2026 год</w:t>
+            </w:r>
+          </w:p>
+        </w:tc>
+      </w:tr>
+    </w:tbl>
+    <w:p>
+      <w:pPr>
+        <w:spacing w:after="0" w:before="0" w:line="240" w:lineRule="auto"/>
+        <w:jc w:val="center"/>
+      </w:pPr>
+    </w:p>
+    <w:p>
+      <w:pPr>
+        <w:spacing w:after="0" w:before="0" w:line="240" w:lineRule="auto"/>
+        <w:jc w:val="center"/>
+      </w:pPr>
+    </w:p>
+    <w:p>
+      <w:pPr>
+        <w:spacing w:after="0" w:before="0" w:line="240" w:lineRule="auto"/>
+        <w:jc w:val="center"/>
+      </w:pPr>
+    </w:p>
+    <w:p>
+      <w:pPr>
+        <w:spacing w:after="0" w:before="0" w:line="240" w:lineRule="auto"/>
+        <w:jc w:val="center"/>
+      </w:pPr>
+    </w:p>
+    <w:p>
+      <w:pPr>
+        <w:spacing w:after="0" w:before="0" w:line="240" w:lineRule="auto"/>
         <w:jc w:val="center"/>
       </w:pPr>
       <w:r>
@@ -89,63 +366,7 @@
           <w:i w:val="0"/>
           <w:sz w:val="28"/>
         </w:rPr>
-        <w:t>МДК.01.03 Разработка мобильных приложений</w:t>
-      </w:r>
-    </w:p>
-    <w:p>
-      <w:pPr>
-        <w:spacing w:after="720" w:line="276" w:lineRule="auto"/>
-        <w:jc w:val="center"/>
-      </w:pPr>
-      <w:r>
-        <w:rPr>
-          <w:rFonts w:ascii="Times New Roman" w:hAnsi="Times New Roman" w:eastAsia="Times New Roman"/>
-          <w:b w:val="0"/>
-          <w:i w:val="0"/>
-          <w:sz w:val="28"/>
-        </w:rPr>
-        <w:t>Тема: «Реализация макетов проектов в приложении Flutter.</w:t>
-        <w:br/>
-        <w:t>Изучение основных элементов интерфейса»</w:t>
-      </w:r>
-    </w:p>
-    <w:p>
-      <w:pPr>
-        <w:spacing w:before="960"/>
-        <w:jc w:val="right"/>
-      </w:pPr>
-      <w:r>
-        <w:rPr>
-          <w:rFonts w:ascii="Times New Roman" w:hAnsi="Times New Roman" w:eastAsia="Times New Roman"/>
-          <w:b w:val="0"/>
-          <w:i w:val="0"/>
-          <w:sz w:val="28"/>
-        </w:rPr>
-        <w:t>Выполнил(а): студент(ка) группы __________</w:t>
-        <w:br/>
-        <w:t>____________________________________</w:t>
-        <w:br/>
-        <w:t>(ФИО)</w:t>
-        <w:br/>
-        <w:br/>
-        <w:t>Проверил(а): ________________________</w:t>
-        <w:br/>
-        <w:t>(ФИО преподавателя)</w:t>
-      </w:r>
-    </w:p>
-    <w:p>
-      <w:pPr>
-        <w:spacing w:before="1600"/>
-        <w:jc w:val="center"/>
-      </w:pPr>
-      <w:r>
-        <w:rPr>
-          <w:rFonts w:ascii="Times New Roman" w:hAnsi="Times New Roman" w:eastAsia="Times New Roman"/>
-          <w:b/>
-          <w:i w:val="0"/>
-          <w:sz w:val="28"/>
-        </w:rPr>
-        <w:t>Москва, 2026</w:t>
+        <w:t>Москва 2026</w:t>
       </w:r>
     </w:p>
     <w:p>
@@ -155,7 +376,7 @@
     </w:p>
     <w:p>
       <w:pPr>
-        <w:spacing w:before="240" w:after="160"/>
+        <w:spacing w:after="240" w:before="0" w:line="240" w:lineRule="auto"/>
         <w:jc w:val="center"/>
       </w:pPr>
       <w:r>
@@ -165,14 +386,13 @@
           <w:i w:val="0"/>
           <w:sz w:val="32"/>
         </w:rPr>
-        <w:t>1. Цель работы</w:t>
+        <w:t>СОДЕРЖАНИЕ</w:t>
       </w:r>
     </w:p>
     <w:p>
       <w:pPr>
-        <w:spacing w:line="360" w:lineRule="auto"/>
-        <w:ind w:firstLine="709"/>
-        <w:jc w:val="both"/>
+        <w:spacing w:after="120" w:line="360" w:lineRule="auto"/>
+        <w:jc w:val="left"/>
       </w:pPr>
       <w:r>
         <w:rPr>
@@ -181,12 +401,17 @@
           <w:i w:val="0"/>
           <w:sz w:val="28"/>
         </w:rPr>
-        <w:t>Изучить основные элементы интерфейса Flutter (виджеты компоновки, кнопки, списки, карточки, навигацию) и реализовать макеты мобильных экранов по дизайну из Figma. Для оценки «5» выполнены 4 макета: 2 простых и 2 сложных.</w:t>
+        <w:t>ПРАКТИЧЕСКАЯ РАБОТА №1 ................................................................. 3</w:t>
+      </w:r>
+    </w:p>
+    <w:p>
+      <w:r>
+        <w:br w:type="page"/>
       </w:r>
     </w:p>
     <w:p>
       <w:pPr>
-        <w:spacing w:before="240" w:after="160"/>
+        <w:pStyle w:val="Heading1"/>
         <w:jc w:val="center"/>
       </w:pPr>
       <w:r>
@@ -196,14 +421,19 @@
           <w:i w:val="0"/>
           <w:sz w:val="32"/>
         </w:rPr>
-        <w:t>2. Задание</w:t>
+        <w:t>ПРАКТИЧЕСКАЯ РАБОТА №1</w:t>
       </w:r>
     </w:p>
     <w:p>
       <w:pPr>
-        <w:spacing w:line="360" w:lineRule="auto"/>
-        <w:ind w:firstLine="709"/>
-        <w:jc w:val="both"/>
+        <w:spacing w:after="120" w:line="360" w:lineRule="auto"/>
+        <w:jc w:val="left"/>
+      </w:pPr>
+    </w:p>
+    <w:p>
+      <w:pPr>
+        <w:spacing w:after="120" w:line="360" w:lineRule="auto"/>
+        <w:jc w:val="left"/>
       </w:pPr>
       <w:r>
         <w:rPr>
@@ -212,14 +442,19 @@
           <w:i w:val="0"/>
           <w:sz w:val="28"/>
         </w:rPr>
-        <w:t>Реализовать макеты проектов в приложении Flutter, изучив основные элементы интерфейса.</w:t>
+        <w:t>Цель работы: реализовать макеты проектов в приложении Flutter, изучить основные элементы интерфейса. Для оценки «5» выполнены 4 макета (2 простых и 2 сложных) по файлу Figma.</w:t>
       </w:r>
     </w:p>
     <w:p>
       <w:pPr>
-        <w:spacing w:line="360" w:lineRule="auto"/>
-        <w:ind w:firstLine="709"/>
-        <w:jc w:val="both"/>
+        <w:spacing w:after="120" w:line="360" w:lineRule="auto"/>
+        <w:jc w:val="left"/>
+      </w:pPr>
+    </w:p>
+    <w:p>
+      <w:pPr>
+        <w:spacing w:after="120" w:line="360" w:lineRule="auto"/>
+        <w:jc w:val="left"/>
       </w:pPr>
       <w:r>
         <w:rPr>
@@ -228,14 +463,34 @@
           <w:i w:val="0"/>
           <w:sz w:val="28"/>
         </w:rPr>
-        <w:t>1 страница — лёгкие (простые) макеты.</w:t>
+        <w:t>Макет: https://www.figma.com/design/neJsVnKChShgyFs39ECHf5/Untitled?node-id=1-1229</w:t>
       </w:r>
     </w:p>
     <w:p>
       <w:pPr>
-        <w:spacing w:line="360" w:lineRule="auto"/>
-        <w:ind w:firstLine="709"/>
-        <w:jc w:val="both"/>
+        <w:spacing w:after="120" w:line="360" w:lineRule="auto"/>
+        <w:jc w:val="left"/>
+      </w:pPr>
+    </w:p>
+    <w:p>
+      <w:pPr>
+        <w:spacing w:after="120" w:line="360" w:lineRule="auto"/>
+        <w:jc w:val="left"/>
+      </w:pPr>
+      <w:r>
+        <w:rPr>
+          <w:rFonts w:ascii="Times New Roman" w:hAnsi="Times New Roman" w:eastAsia="Times New Roman"/>
+          <w:b/>
+          <w:i w:val="0"/>
+          <w:sz w:val="28"/>
+        </w:rPr>
+        <w:t>Файл lib/main.dart:</w:t>
+      </w:r>
+    </w:p>
+    <w:p>
+      <w:pPr>
+        <w:spacing w:after="120" w:line="360" w:lineRule="auto"/>
+        <w:jc w:val="left"/>
       </w:pPr>
       <w:r>
         <w:rPr>
@@ -244,14 +499,28 @@
           <w:i w:val="0"/>
           <w:sz w:val="28"/>
         </w:rPr>
-        <w:t>2 страница — сложные макеты.</w:t>
+        <w:t>В этом файле запускается приложение. Используются методы runApp, виджеты MaterialApp и тема оформления. Главным экраном назначен HomeScreen с вкладками «Простые макеты» и «Сложные макеты».</w:t>
       </w:r>
     </w:p>
     <w:p>
       <w:pPr>
-        <w:spacing w:line="360" w:lineRule="auto"/>
-        <w:ind w:firstLine="709"/>
-        <w:jc w:val="both"/>
+        <w:spacing w:after="120" w:line="360" w:lineRule="auto"/>
+        <w:jc w:val="left"/>
+      </w:pPr>
+      <w:r>
+        <w:rPr>
+          <w:rFonts w:ascii="Times New Roman" w:hAnsi="Times New Roman" w:eastAsia="Times New Roman"/>
+          <w:b/>
+          <w:i w:val="0"/>
+          <w:sz w:val="28"/>
+        </w:rPr>
+        <w:t>Файл lib/screens/home_screen.dart:</w:t>
+      </w:r>
+    </w:p>
+    <w:p>
+      <w:pPr>
+        <w:spacing w:after="120" w:line="360" w:lineRule="auto"/>
+        <w:jc w:val="left"/>
       </w:pPr>
       <w:r>
         <w:rPr>
@@ -260,14 +529,13 @@
           <w:i w:val="0"/>
           <w:sz w:val="28"/>
         </w:rPr>
-        <w:t>Критерии:</w:t>
+        <w:t>В этом файле разработана навигация по страницам макета. Используются виджеты DefaultTabController, AppBar, TabBar, TabBarView, ListView, Material, InkWell и Navigator.push.</w:t>
       </w:r>
     </w:p>
     <w:p>
       <w:pPr>
-        <w:spacing w:line="360" w:lineRule="auto"/>
-        <w:ind w:firstLine="709"/>
-        <w:jc w:val="both"/>
+        <w:spacing w:after="120" w:line="360" w:lineRule="auto"/>
+        <w:jc w:val="left"/>
       </w:pPr>
       <w:r>
         <w:rPr>
@@ -276,116 +544,7 @@
           <w:i w:val="0"/>
           <w:sz w:val="28"/>
         </w:rPr>
-        <w:t>— оценка 3: 2 макета (2 простых);</w:t>
-      </w:r>
-    </w:p>
-    <w:p>
-      <w:pPr>
-        <w:spacing w:line="360" w:lineRule="auto"/>
-        <w:ind w:firstLine="709"/>
-        <w:jc w:val="both"/>
-      </w:pPr>
-      <w:r>
-        <w:rPr>
-          <w:rFonts w:ascii="Times New Roman" w:hAnsi="Times New Roman" w:eastAsia="Times New Roman"/>
-          <w:b w:val="0"/>
-          <w:i w:val="0"/>
-          <w:sz w:val="28"/>
-        </w:rPr>
-        <w:t>— оценка 4: 3 макета (2 простых, 1 сложный);</w:t>
-      </w:r>
-    </w:p>
-    <w:p>
-      <w:pPr>
-        <w:spacing w:line="360" w:lineRule="auto"/>
-        <w:ind w:firstLine="709"/>
-        <w:jc w:val="both"/>
-      </w:pPr>
-      <w:r>
-        <w:rPr>
-          <w:rFonts w:ascii="Times New Roman" w:hAnsi="Times New Roman" w:eastAsia="Times New Roman"/>
-          <w:b w:val="0"/>
-          <w:i w:val="0"/>
-          <w:sz w:val="28"/>
-        </w:rPr>
-        <w:t>— оценка 5: 4 макета (2 простых, 2 сложных).</w:t>
-      </w:r>
-    </w:p>
-    <w:p>
-      <w:pPr>
-        <w:spacing w:line="360" w:lineRule="auto"/>
-        <w:jc w:val="both"/>
-      </w:pPr>
-      <w:r>
-        <w:rPr>
-          <w:rFonts w:ascii="Times New Roman" w:hAnsi="Times New Roman" w:eastAsia="Times New Roman"/>
-          <w:b w:val="0"/>
-          <w:i w:val="0"/>
-          <w:sz w:val="28"/>
-        </w:rPr>
-        <w:t>Исходный макет: https://www.figma.com/design/neJsVnKChShgyFs39ECHf5/Untitled?node-id=1-1229</w:t>
-      </w:r>
-    </w:p>
-    <w:p>
-      <w:pPr>
-        <w:spacing w:before="240" w:after="160"/>
-        <w:jc w:val="center"/>
-      </w:pPr>
-      <w:r>
-        <w:rPr>
-          <w:rFonts w:ascii="Times New Roman" w:hAnsi="Times New Roman" w:eastAsia="Times New Roman"/>
-          <w:b/>
-          <w:i w:val="0"/>
-          <w:sz w:val="32"/>
-        </w:rPr>
-        <w:t>3. Ход работы</w:t>
-      </w:r>
-    </w:p>
-    <w:p>
-      <w:pPr>
-        <w:spacing w:line="360" w:lineRule="auto"/>
-        <w:ind w:firstLine="709"/>
-        <w:jc w:val="both"/>
-      </w:pPr>
-      <w:r>
-        <w:rPr>
-          <w:rFonts w:ascii="Times New Roman" w:hAnsi="Times New Roman" w:eastAsia="Times New Roman"/>
-          <w:b w:val="0"/>
-          <w:i w:val="0"/>
-          <w:sz w:val="28"/>
-        </w:rPr>
-        <w:t>Создан проект Flutter (pr1_makety). На главном экране расположены две вкладки по страницам макета Figma: «Простые макеты» и «Сложные макеты». Каждый экран открывается отдельным маршрутом Navigator.push. Иллюстрации нарисованы виджетами CustomPaint, чтобы не зависеть от истекающих ссылок экспорта Figma.</w:t>
-      </w:r>
-    </w:p>
-    <w:p>
-      <w:pPr>
-        <w:spacing w:before="240" w:after="160"/>
-        <w:jc w:val="center"/>
-      </w:pPr>
-      <w:r>
-        <w:rPr>
-          <w:rFonts w:ascii="Times New Roman" w:hAnsi="Times New Roman" w:eastAsia="Times New Roman"/>
-          <w:b/>
-          <w:i w:val="0"/>
-          <w:sz w:val="32"/>
-        </w:rPr>
-        <w:t>3.1. Главный экран приложения</w:t>
-      </w:r>
-    </w:p>
-    <w:p>
-      <w:pPr>
-        <w:spacing w:line="360" w:lineRule="auto"/>
-        <w:ind w:firstLine="709"/>
-        <w:jc w:val="both"/>
-      </w:pPr>
-      <w:r>
-        <w:rPr>
-          <w:rFonts w:ascii="Times New Roman" w:hAnsi="Times New Roman" w:eastAsia="Times New Roman"/>
-          <w:b w:val="0"/>
-          <w:i w:val="0"/>
-          <w:sz w:val="28"/>
-        </w:rPr>
-        <w:t>Использованы виджеты: MaterialApp, Scaffold, AppBar, DefaultTabController, TabBar, TabBarView, ListView, Card/Material, InkWell, Navigator. Вкладка «Простые макеты» соответствует 1-й странице Figma, «Сложные макеты» — 2-й странице.</w:t>
+        <w:t>Результат работы</w:t>
       </w:r>
     </w:p>
     <w:p>
@@ -395,7 +554,7 @@
       <w:r>
         <w:drawing>
           <wp:inline xmlns:a="http://schemas.openxmlformats.org/drawingml/2006/main" xmlns:pic="http://schemas.openxmlformats.org/drawingml/2006/picture">
-            <wp:extent cx="3060000" cy="6622154"/>
+            <wp:extent cx="2951999" cy="6388428"/>
             <wp:docPr id="1" name="Picture 1"/>
             <wp:cNvGraphicFramePr>
               <a:graphicFrameLocks noChangeAspect="1"/>
@@ -416,7 +575,7 @@
                   <pic:spPr>
                     <a:xfrm>
                       <a:off x="0" y="0"/>
-                      <a:ext cx="3060000" cy="6622154"/>
+                      <a:ext cx="2951999" cy="6388428"/>
                     </a:xfrm>
                     <a:prstGeom prst="rect"/>
                   </pic:spPr>
@@ -438,29 +597,28 @@
           <w:i/>
           <w:sz w:val="24"/>
         </w:rPr>
-        <w:t>Рисунок 1 — Главный экран (простые макеты)</w:t>
+        <w:t>Рисунок 1 – Главный экран приложения (простые макеты)</w:t>
       </w:r>
     </w:p>
     <w:p>
       <w:pPr>
-        <w:spacing w:before="240" w:after="160"/>
-        <w:jc w:val="center"/>
+        <w:spacing w:after="120" w:line="360" w:lineRule="auto"/>
+        <w:jc w:val="left"/>
       </w:pPr>
       <w:r>
         <w:rPr>
           <w:rFonts w:ascii="Times New Roman" w:hAnsi="Times New Roman" w:eastAsia="Times New Roman"/>
           <w:b/>
           <w:i w:val="0"/>
-          <w:sz w:val="32"/>
+          <w:sz w:val="28"/>
         </w:rPr>
-        <w:t>3.2. Простой макет 1. medinow</w:t>
+        <w:t>Файл lib/screens/simple/medinow_screen.dart:</w:t>
       </w:r>
     </w:p>
     <w:p>
       <w:pPr>
-        <w:spacing w:line="360" w:lineRule="auto"/>
-        <w:ind w:firstLine="709"/>
-        <w:jc w:val="both"/>
+        <w:spacing w:after="120" w:line="360" w:lineRule="auto"/>
+        <w:jc w:val="left"/>
       </w:pPr>
       <w:r>
         <w:rPr>
@@ -469,14 +627,13 @@
           <w:i w:val="0"/>
           <w:sz w:val="28"/>
         </w:rPr>
-        <w:t>Экран входа в приложение медитации. Фон задан цветом #02B1B5. Заголовок и подзаголовок выровнены по центру в Column. Кнопки «Sign in with Apple» и «Continue with Email or Phone» выполнены виджетом ElevatedButton со StadiumBorder. Ссылка «Continue With Google» — TextButton. Внизу — композиция Stack: растения (CustomPaint) и фигура человека в позе лотоса.</w:t>
+        <w:t>В этом файле разработан простой макет входа medinow. Используются виджеты Scaffold, SafeArea, Column, Spacer, Text, ElevatedButton, TextButton, Stack, Positioned и CustomPaint.</w:t>
       </w:r>
     </w:p>
     <w:p>
       <w:pPr>
-        <w:spacing w:line="360" w:lineRule="auto"/>
-        <w:ind w:firstLine="709"/>
-        <w:jc w:val="both"/>
+        <w:spacing w:after="120" w:line="360" w:lineRule="auto"/>
+        <w:jc w:val="left"/>
       </w:pPr>
       <w:r>
         <w:rPr>
@@ -485,7 +642,7 @@
           <w:i w:val="0"/>
           <w:sz w:val="28"/>
         </w:rPr>
-        <w:t>Виджеты: Scaffold, SafeArea, Column, Spacer, Text, ElevatedButton, TextButton, Stack, Positioned, CustomPaint.</w:t>
+        <w:t>Результат работы</w:t>
       </w:r>
     </w:p>
     <w:p>
@@ -495,7 +652,7 @@
       <w:r>
         <w:drawing>
           <wp:inline xmlns:a="http://schemas.openxmlformats.org/drawingml/2006/main" xmlns:pic="http://schemas.openxmlformats.org/drawingml/2006/picture">
-            <wp:extent cx="3060000" cy="6622154"/>
+            <wp:extent cx="2951999" cy="6388428"/>
             <wp:docPr id="2" name="Picture 2"/>
             <wp:cNvGraphicFramePr>
               <a:graphicFrameLocks noChangeAspect="1"/>
@@ -516,7 +673,7 @@
                   <pic:spPr>
                     <a:xfrm>
                       <a:off x="0" y="0"/>
-                      <a:ext cx="3060000" cy="6622154"/>
+                      <a:ext cx="2951999" cy="6388428"/>
                     </a:xfrm>
                     <a:prstGeom prst="rect"/>
                   </pic:spPr>
@@ -538,29 +695,28 @@
           <w:i/>
           <w:sz w:val="24"/>
         </w:rPr>
-        <w:t>Рисунок 2 — Простой макет medinow</w:t>
+        <w:t>Рисунок 2 – Результат окошка medinow</w:t>
       </w:r>
     </w:p>
     <w:p>
       <w:pPr>
-        <w:spacing w:before="240" w:after="160"/>
-        <w:jc w:val="center"/>
+        <w:spacing w:after="120" w:line="360" w:lineRule="auto"/>
+        <w:jc w:val="left"/>
       </w:pPr>
       <w:r>
         <w:rPr>
           <w:rFonts w:ascii="Times New Roman" w:hAnsi="Times New Roman" w:eastAsia="Times New Roman"/>
           <w:b/>
           <w:i w:val="0"/>
-          <w:sz w:val="32"/>
+          <w:sz w:val="28"/>
         </w:rPr>
-        <w:t>3.3. Простой макет 2. Mind Deep Relax</w:t>
+        <w:t>Файл lib/screens/simple/mind_relax_screen.dart:</w:t>
       </w:r>
     </w:p>
     <w:p>
       <w:pPr>
-        <w:spacing w:line="360" w:lineRule="auto"/>
-        <w:ind w:firstLine="709"/>
-        <w:jc w:val="both"/>
+        <w:spacing w:after="120" w:line="360" w:lineRule="auto"/>
+        <w:jc w:val="left"/>
       </w:pPr>
       <w:r>
         <w:rPr>
@@ -569,14 +725,13 @@
           <w:i w:val="0"/>
           <w:sz w:val="28"/>
         </w:rPr>
-        <w:t>Экран сессии медитации. Сверху — иллюстрация человека на утёсе (CustomPaint в ClipRRect). Далее текстовый блок автора и описания. Основное действие — ElevatedButton.icon «Play Next Session». Список сессий собран из Row: цветной контейнер с иконкой воспроизведения, заголовок, подзаголовок и IconButton.</w:t>
+        <w:t>В этом файле разработан простой макет Mind Deep Relax. Используются виджеты ListView, ClipRRect, Column, Text, ElevatedButton.icon, Row, Container, Icon и IconButton.</w:t>
       </w:r>
     </w:p>
     <w:p>
       <w:pPr>
-        <w:spacing w:line="360" w:lineRule="auto"/>
-        <w:ind w:firstLine="709"/>
-        <w:jc w:val="both"/>
+        <w:spacing w:after="120" w:line="360" w:lineRule="auto"/>
+        <w:jc w:val="left"/>
       </w:pPr>
       <w:r>
         <w:rPr>
@@ -585,7 +740,7 @@
           <w:i w:val="0"/>
           <w:sz w:val="28"/>
         </w:rPr>
-        <w:t>Виджеты: ListView, ClipRRect, Column, Text, ElevatedButton.icon, Row, Container, Icon, IconButton.</w:t>
+        <w:t>Результат работы</w:t>
       </w:r>
     </w:p>
     <w:p>
@@ -595,7 +750,7 @@
       <w:r>
         <w:drawing>
           <wp:inline xmlns:a="http://schemas.openxmlformats.org/drawingml/2006/main" xmlns:pic="http://schemas.openxmlformats.org/drawingml/2006/picture">
-            <wp:extent cx="3060000" cy="6622154"/>
+            <wp:extent cx="2951999" cy="6388428"/>
             <wp:docPr id="3" name="Picture 3"/>
             <wp:cNvGraphicFramePr>
               <a:graphicFrameLocks noChangeAspect="1"/>
@@ -616,7 +771,7 @@
                   <pic:spPr>
                     <a:xfrm>
                       <a:off x="0" y="0"/>
-                      <a:ext cx="3060000" cy="6622154"/>
+                      <a:ext cx="2951999" cy="6388428"/>
                     </a:xfrm>
                     <a:prstGeom prst="rect"/>
                   </pic:spPr>
@@ -638,29 +793,28 @@
           <w:i/>
           <w:sz w:val="24"/>
         </w:rPr>
-        <w:t>Рисунок 3 — Простой макет Mind Deep Relax</w:t>
+        <w:t>Рисунок 3 – Результат окошка Mind Deep Relax</w:t>
       </w:r>
     </w:p>
     <w:p>
       <w:pPr>
-        <w:spacing w:before="240" w:after="160"/>
-        <w:jc w:val="center"/>
+        <w:spacing w:after="120" w:line="360" w:lineRule="auto"/>
+        <w:jc w:val="left"/>
       </w:pPr>
       <w:r>
         <w:rPr>
           <w:rFonts w:ascii="Times New Roman" w:hAnsi="Times New Roman" w:eastAsia="Times New Roman"/>
           <w:b/>
           <w:i w:val="0"/>
-          <w:sz w:val="32"/>
+          <w:sz w:val="28"/>
         </w:rPr>
-        <w:t>3.4. Сложный макет 1. Meditate</w:t>
+        <w:t>Файл lib/screens/complex/meditate_screen.dart:</w:t>
       </w:r>
     </w:p>
     <w:p>
       <w:pPr>
-        <w:spacing w:line="360" w:lineRule="auto"/>
-        <w:ind w:firstLine="709"/>
-        <w:jc w:val="both"/>
+        <w:spacing w:after="120" w:line="360" w:lineRule="auto"/>
+        <w:jc w:val="left"/>
       </w:pPr>
       <w:r>
         <w:rPr>
@@ -669,14 +823,13 @@
           <w:i w:val="0"/>
           <w:sz w:val="28"/>
         </w:rPr>
-        <w:t>Каталог медитаций. Шапка — Row с заголовком и IconButton поиска. Горизонтальный ListView с ChoiceChip для категорий (All, Bible In a Year, Dailies и др.). Крупная карточка «A Song of Moon» и сетка 2×2 из Row/Expanded. Состояние выбранного чипа хранится в StatefulWidget.</w:t>
+        <w:t>В этом файле разработан сложный макет Meditate. Используются виджеты StatefulWidget, ListView, ChoiceChip, Row, Expanded, CustomPaint, Icon и Text. Выбранная категория хранится в состоянии экрана.</w:t>
       </w:r>
     </w:p>
     <w:p>
       <w:pPr>
-        <w:spacing w:line="360" w:lineRule="auto"/>
-        <w:ind w:firstLine="709"/>
-        <w:jc w:val="both"/>
+        <w:spacing w:after="120" w:line="360" w:lineRule="auto"/>
+        <w:jc w:val="left"/>
       </w:pPr>
       <w:r>
         <w:rPr>
@@ -685,7 +838,7 @@
           <w:i w:val="0"/>
           <w:sz w:val="28"/>
         </w:rPr>
-        <w:t>Виджеты: StatefulWidget, ListView, ChoiceChip, Row, Expanded, CustomPaint, Icon, Text.</w:t>
+        <w:t>Результат работы</w:t>
       </w:r>
     </w:p>
     <w:p>
@@ -695,7 +848,7 @@
       <w:r>
         <w:drawing>
           <wp:inline xmlns:a="http://schemas.openxmlformats.org/drawingml/2006/main" xmlns:pic="http://schemas.openxmlformats.org/drawingml/2006/picture">
-            <wp:extent cx="3060000" cy="6622154"/>
+            <wp:extent cx="2951999" cy="6388428"/>
             <wp:docPr id="4" name="Picture 4"/>
             <wp:cNvGraphicFramePr>
               <a:graphicFrameLocks noChangeAspect="1"/>
@@ -716,7 +869,7 @@
                   <pic:spPr>
                     <a:xfrm>
                       <a:off x="0" y="0"/>
-                      <a:ext cx="3060000" cy="6622154"/>
+                      <a:ext cx="2951999" cy="6388428"/>
                     </a:xfrm>
                     <a:prstGeom prst="rect"/>
                   </pic:spPr>
@@ -738,29 +891,28 @@
           <w:i/>
           <w:sz w:val="24"/>
         </w:rPr>
-        <w:t>Рисунок 4 — Сложный макет Meditate</w:t>
+        <w:t>Рисунок 4 – Результат окошка Meditate</w:t>
       </w:r>
     </w:p>
     <w:p>
       <w:pPr>
-        <w:spacing w:before="240" w:after="160"/>
-        <w:jc w:val="center"/>
+        <w:spacing w:after="120" w:line="360" w:lineRule="auto"/>
+        <w:jc w:val="left"/>
       </w:pPr>
       <w:r>
         <w:rPr>
           <w:rFonts w:ascii="Times New Roman" w:hAnsi="Times New Roman" w:eastAsia="Times New Roman"/>
           <w:b/>
           <w:i w:val="0"/>
-          <w:sz w:val="32"/>
+          <w:sz w:val="28"/>
         </w:rPr>
-        <w:t>3.5. Сложный макет 2. Secrets of Atlantis</w:t>
+        <w:t>Файл lib/screens/complex/atlantis_screen.dart:</w:t>
       </w:r>
     </w:p>
     <w:p>
       <w:pPr>
-        <w:spacing w:line="360" w:lineRule="auto"/>
-        <w:ind w:firstLine="709"/>
-        <w:jc w:val="both"/>
+        <w:spacing w:after="120" w:line="360" w:lineRule="auto"/>
+        <w:jc w:val="left"/>
       </w:pPr>
       <w:r>
         <w:rPr>
@@ -769,14 +921,13 @@
           <w:i w:val="0"/>
           <w:sz w:val="28"/>
         </w:rPr>
-        <w:t>Карточка подкаста. Верхняя часть — Stack: фон-иллюстрация, кнопка «назад» и круглая оранжевая кнопка Play, которая перекрывает границу шапки (отрицательный offset). Ниже — OutlinedButton «Follow». Карточка ведущего Codin собрана из вложенных Container с BorderRadius, CircleAvatar, Row со звёздами и тегом Fantasy, индикатором Live и аватарками слушателей. Жёлтый блок приглашения друзей — ещё один Row с иконкой Share.</w:t>
+        <w:t>В этом файле разработан сложный макет Secrets of Atlantis. Используются виджеты Stack, Positioned, CircleAvatar, OutlinedButton, Container, Column, Row, Icon, Text, ListView и MediaQuery.</w:t>
       </w:r>
     </w:p>
     <w:p>
       <w:pPr>
-        <w:spacing w:line="360" w:lineRule="auto"/>
-        <w:ind w:firstLine="709"/>
-        <w:jc w:val="both"/>
+        <w:spacing w:after="120" w:line="360" w:lineRule="auto"/>
+        <w:jc w:val="left"/>
       </w:pPr>
       <w:r>
         <w:rPr>
@@ -785,7 +936,7 @@
           <w:i w:val="0"/>
           <w:sz w:val="28"/>
         </w:rPr>
-        <w:t>Виджеты: Stack, Positioned, CircleAvatar, OutlinedButton, Container, Column, Row, Icon, Text, ListView, MediaQuery.</w:t>
+        <w:t>Результат работы</w:t>
       </w:r>
     </w:p>
     <w:p>
@@ -795,7 +946,7 @@
       <w:r>
         <w:drawing>
           <wp:inline xmlns:a="http://schemas.openxmlformats.org/drawingml/2006/main" xmlns:pic="http://schemas.openxmlformats.org/drawingml/2006/picture">
-            <wp:extent cx="3060000" cy="6622154"/>
+            <wp:extent cx="2951999" cy="6388428"/>
             <wp:docPr id="5" name="Picture 5"/>
             <wp:cNvGraphicFramePr>
               <a:graphicFrameLocks noChangeAspect="1"/>
@@ -816,7 +967,7 @@
                   <pic:spPr>
                     <a:xfrm>
                       <a:off x="0" y="0"/>
-                      <a:ext cx="3060000" cy="6622154"/>
+                      <a:ext cx="2951999" cy="6388428"/>
                     </a:xfrm>
                     <a:prstGeom prst="rect"/>
                   </pic:spPr>
@@ -838,28 +989,19 @@
           <w:i/>
           <w:sz w:val="24"/>
         </w:rPr>
-        <w:t>Рисунок 5 — Сложный макет Secrets of Atlantis</w:t>
+        <w:t>Рисунок 5 – Результат окошка Secrets of Atlantis</w:t>
       </w:r>
     </w:p>
     <w:p>
       <w:pPr>
-        <w:spacing w:before="240" w:after="160"/>
-        <w:jc w:val="center"/>
+        <w:spacing w:after="120" w:line="360" w:lineRule="auto"/>
+        <w:jc w:val="left"/>
       </w:pPr>
-      <w:r>
-        <w:rPr>
-          <w:rFonts w:ascii="Times New Roman" w:hAnsi="Times New Roman" w:eastAsia="Times New Roman"/>
-          <w:b/>
-          <w:i w:val="0"/>
-          <w:sz w:val="32"/>
-        </w:rPr>
-        <w:t>4. Структура проекта</w:t>
-      </w:r>
     </w:p>
     <w:p>
       <w:pPr>
-        <w:spacing w:line="360" w:lineRule="auto"/>
-        <w:jc w:val="both"/>
+        <w:spacing w:after="120" w:line="360" w:lineRule="auto"/>
+        <w:jc w:val="left"/>
       </w:pPr>
       <w:r>
         <w:rPr>
@@ -868,239 +1010,11 @@
           <w:i w:val="0"/>
           <w:sz w:val="28"/>
         </w:rPr>
-        <w:t>lib/main.dart — точка входа, MaterialApp.</w:t>
-      </w:r>
-    </w:p>
-    <w:p>
-      <w:pPr>
-        <w:spacing w:line="360" w:lineRule="auto"/>
-        <w:jc w:val="both"/>
-      </w:pPr>
-      <w:r>
-        <w:rPr>
-          <w:rFonts w:ascii="Times New Roman" w:hAnsi="Times New Roman" w:eastAsia="Times New Roman"/>
-          <w:b w:val="0"/>
-          <w:i w:val="0"/>
-          <w:sz w:val="28"/>
-        </w:rPr>
-        <w:t>lib/theme.dart — цвета и тема.</w:t>
-      </w:r>
-    </w:p>
-    <w:p>
-      <w:pPr>
-        <w:spacing w:line="360" w:lineRule="auto"/>
-        <w:jc w:val="both"/>
-      </w:pPr>
-      <w:r>
-        <w:rPr>
-          <w:rFonts w:ascii="Times New Roman" w:hAnsi="Times New Roman" w:eastAsia="Times New Roman"/>
-          <w:b w:val="0"/>
-          <w:i w:val="0"/>
-          <w:sz w:val="28"/>
-        </w:rPr>
-        <w:t>lib/screens/home_screen.dart — вкладки простых и сложных макетов.</w:t>
-      </w:r>
-    </w:p>
-    <w:p>
-      <w:pPr>
-        <w:spacing w:line="360" w:lineRule="auto"/>
-        <w:jc w:val="both"/>
-      </w:pPr>
-      <w:r>
-        <w:rPr>
-          <w:rFonts w:ascii="Times New Roman" w:hAnsi="Times New Roman" w:eastAsia="Times New Roman"/>
-          <w:b w:val="0"/>
-          <w:i w:val="0"/>
-          <w:sz w:val="28"/>
-        </w:rPr>
-        <w:t>lib/screens/simple/medinow_screen.dart, mind_relax_screen.dart — простые экраны.</w:t>
-      </w:r>
-    </w:p>
-    <w:p>
-      <w:pPr>
-        <w:spacing w:line="360" w:lineRule="auto"/>
-        <w:jc w:val="both"/>
-      </w:pPr>
-      <w:r>
-        <w:rPr>
-          <w:rFonts w:ascii="Times New Roman" w:hAnsi="Times New Roman" w:eastAsia="Times New Roman"/>
-          <w:b w:val="0"/>
-          <w:i w:val="0"/>
-          <w:sz w:val="28"/>
-        </w:rPr>
-        <w:t>lib/screens/complex/meditate_screen.dart, atlantis_screen.dart — сложные экраны.</w:t>
-      </w:r>
-    </w:p>
-    <w:p>
-      <w:pPr>
-        <w:spacing w:line="360" w:lineRule="auto"/>
-        <w:jc w:val="both"/>
-      </w:pPr>
-      <w:r>
-        <w:rPr>
-          <w:rFonts w:ascii="Times New Roman" w:hAnsi="Times New Roman" w:eastAsia="Times New Roman"/>
-          <w:b w:val="0"/>
-          <w:i w:val="0"/>
-          <w:sz w:val="28"/>
-        </w:rPr>
-        <w:t>lib/widgets/illustrations.dart — CustomPaint-иллюстрации.</w:t>
-      </w:r>
-    </w:p>
-    <w:p>
-      <w:pPr>
-        <w:spacing w:before="240" w:after="160"/>
-        <w:jc w:val="center"/>
-      </w:pPr>
-      <w:r>
-        <w:rPr>
-          <w:rFonts w:ascii="Times New Roman" w:hAnsi="Times New Roman" w:eastAsia="Times New Roman"/>
-          <w:b/>
-          <w:i w:val="0"/>
-          <w:sz w:val="32"/>
-        </w:rPr>
-        <w:t>5. Ссылка на репозиторий</w:t>
-      </w:r>
-    </w:p>
-    <w:p>
-      <w:pPr>
-        <w:spacing w:line="360" w:lineRule="auto"/>
-        <w:ind w:firstLine="709"/>
-        <w:jc w:val="both"/>
-      </w:pPr>
-      <w:r>
-        <w:rPr>
-          <w:rFonts w:ascii="Times New Roman" w:hAnsi="Times New Roman" w:eastAsia="Times New Roman"/>
-          <w:b w:val="0"/>
-          <w:i w:val="0"/>
-          <w:sz w:val="28"/>
-        </w:rPr>
-        <w:t>Исходный код приложения размещён в репозитории (вставить ссылку после публикации):</w:t>
-      </w:r>
-    </w:p>
-    <w:p>
-      <w:pPr>
-        <w:spacing w:line="360" w:lineRule="auto"/>
-        <w:jc w:val="both"/>
-      </w:pPr>
-      <w:r>
-        <w:rPr>
-          <w:rFonts w:ascii="Times New Roman" w:hAnsi="Times New Roman" w:eastAsia="Times New Roman"/>
-          <w:b w:val="0"/>
-          <w:i w:val="0"/>
-          <w:sz w:val="28"/>
-        </w:rPr>
-        <w:t>https://github.com/____________________/pr1_makety</w:t>
-      </w:r>
-    </w:p>
-    <w:p>
-      <w:pPr>
-        <w:spacing w:line="360" w:lineRule="auto"/>
-        <w:ind w:firstLine="709"/>
-        <w:jc w:val="both"/>
-      </w:pPr>
-      <w:r>
-        <w:rPr>
-          <w:rFonts w:ascii="Times New Roman" w:hAnsi="Times New Roman" w:eastAsia="Times New Roman"/>
-          <w:b w:val="0"/>
-          <w:i w:val="0"/>
-          <w:sz w:val="28"/>
-        </w:rPr>
-        <w:t>Папка с проектом: pr1_makety. Для проверки: flutter pub get &amp;&amp; flutter run.</w:t>
-      </w:r>
-    </w:p>
-    <w:p>
-      <w:pPr>
-        <w:spacing w:before="240" w:after="160"/>
-        <w:jc w:val="center"/>
-      </w:pPr>
-      <w:r>
-        <w:rPr>
-          <w:rFonts w:ascii="Times New Roman" w:hAnsi="Times New Roman" w:eastAsia="Times New Roman"/>
-          <w:b/>
-          <w:i w:val="0"/>
-          <w:sz w:val="32"/>
-        </w:rPr>
-        <w:t>6. Вывод</w:t>
-      </w:r>
-    </w:p>
-    <w:p>
-      <w:pPr>
-        <w:spacing w:line="360" w:lineRule="auto"/>
-        <w:ind w:firstLine="709"/>
-        <w:jc w:val="both"/>
-      </w:pPr>
-      <w:r>
-        <w:rPr>
-          <w:rFonts w:ascii="Times New Roman" w:hAnsi="Times New Roman" w:eastAsia="Times New Roman"/>
-          <w:b w:val="0"/>
-          <w:i w:val="0"/>
-          <w:sz w:val="28"/>
-        </w:rPr>
-        <w:t>В ходе практической работы изучены основные виджеты интерфейса Flutter (Scaffold, Column, Row, Stack, ListView, кнопки, чипы, навигация) и реализованы 4 макета по Figma: два простых (medinow, Mind Deep Relax) и два сложных (Meditate, Secrets of Atlantis). Цель работы достигнута, требования на оценку «5» выполнены.</w:t>
-      </w:r>
-    </w:p>
-    <w:p>
-      <w:pPr>
-        <w:spacing w:before="240" w:after="160"/>
-        <w:jc w:val="center"/>
-      </w:pPr>
-      <w:r>
-        <w:rPr>
-          <w:rFonts w:ascii="Times New Roman" w:hAnsi="Times New Roman" w:eastAsia="Times New Roman"/>
-          <w:b/>
-          <w:i w:val="0"/>
-          <w:sz w:val="32"/>
-        </w:rPr>
-        <w:t>7. Список источников</w:t>
-      </w:r>
-    </w:p>
-    <w:p>
-      <w:pPr>
-        <w:spacing w:line="360" w:lineRule="auto"/>
-        <w:jc w:val="both"/>
-      </w:pPr>
-      <w:r>
-        <w:rPr>
-          <w:rFonts w:ascii="Times New Roman" w:hAnsi="Times New Roman" w:eastAsia="Times New Roman"/>
-          <w:b w:val="0"/>
-          <w:i w:val="0"/>
-          <w:sz w:val="28"/>
-        </w:rPr>
-        <w:t>1. Документация Flutter. URL: https://docs.flutter.dev/</w:t>
-      </w:r>
-    </w:p>
-    <w:p>
-      <w:pPr>
-        <w:spacing w:line="360" w:lineRule="auto"/>
-        <w:jc w:val="both"/>
-      </w:pPr>
-      <w:r>
-        <w:rPr>
-          <w:rFonts w:ascii="Times New Roman" w:hAnsi="Times New Roman" w:eastAsia="Times New Roman"/>
-          <w:b w:val="0"/>
-          <w:i w:val="0"/>
-          <w:sz w:val="28"/>
-        </w:rPr>
-        <w:t>2. Документация виджетов Flutter. URL: https://api.flutter.dev/</w:t>
-      </w:r>
-    </w:p>
-    <w:p>
-      <w:pPr>
-        <w:spacing w:line="360" w:lineRule="auto"/>
-        <w:jc w:val="both"/>
-      </w:pPr>
-      <w:r>
-        <w:rPr>
-          <w:rFonts w:ascii="Times New Roman" w:hAnsi="Times New Roman" w:eastAsia="Times New Roman"/>
-          <w:b w:val="0"/>
-          <w:i w:val="0"/>
-          <w:sz w:val="28"/>
-        </w:rPr>
-        <w:t>3. Макет Figma к практической работе. URL: https://www.figma.com/design/neJsVnKChShgyFs39ECHf5/Untitled?node-id=1-1229</w:t>
+        <w:t>Вывод: в ходе практической работы изучены основные виджеты интерфейса Flutter и реализованы 4 макета по Figma: два простых (medinow, Mind Deep Relax) и два сложных (Meditate, Secrets of Atlantis). Исходный код приложения: https://github.com/IsaakAles0123/PR1FLUTTER</w:t>
       </w:r>
     </w:p>
     <w:sectPr>
-      <w:pgSz w:w="12240" w:h="15840"/>
+      <w:pgSz w:w="11906" w:h="16838"/>
       <w:pgMar w:top="1134" w:right="850" w:bottom="1134" w:left="1701" w:header="720" w:footer="720" w:gutter="0"/>
       <w:cols w:space="720"/>
       <w:docGrid w:linePitch="360"/>

</xml_diff>

<commit_message>
docs: set student name Aleskerov I.V. and group P50-6-24
</commit_message>
<xml_diff>
--- a/docs/Otchet_PR1.docx
+++ b/docs/Otchet_PR1.docx
@@ -240,7 +240,7 @@
                 <w:i w:val="0"/>
                 <w:sz w:val="28"/>
               </w:rPr>
-              <w:t>Студент группы П50-___-24</w:t>
+              <w:t>Студент группы П50-6-24</w:t>
             </w:r>
           </w:p>
         </w:tc>
@@ -282,7 +282,7 @@
                 <w:i w:val="0"/>
                 <w:sz w:val="28"/>
               </w:rPr>
-              <w:t>Алескеров И.И.</w:t>
+              <w:t>Алескеров И.В.</w:t>
             </w:r>
           </w:p>
         </w:tc>

</xml_diff>

<commit_message>
docs: rebuild the practical report with current mockup screenshots
</commit_message>
<xml_diff>
--- a/docs/Otchet_PR1.docx
+++ b/docs/Otchet_PR1.docx
@@ -627,7 +627,7 @@
           <w:i w:val="0"/>
           <w:sz w:val="28"/>
         </w:rPr>
-        <w:t>В этом файле разработан простой макет входа medinow. Используются виджеты Scaffold, SafeArea, Column, Spacer, Text, ElevatedButton, TextButton, Stack, Positioned и CustomPaint.</w:t>
+        <w:t>В этом файле разработан простой макет входа medinow. Используются виджеты Scaffold, SafeArea, Column, Spacer, Text, ElevatedButton, TextButton и Image.asset для иллюстрации из Figma.</w:t>
       </w:r>
     </w:p>
     <w:p>
@@ -725,7 +725,7 @@
           <w:i w:val="0"/>
           <w:sz w:val="28"/>
         </w:rPr>
-        <w:t>В этом файле разработан простой макет Mind Deep Relax. Используются виджеты ListView, ClipRRect, Column, Text, ElevatedButton.icon, Row, Container, Icon и IconButton.</w:t>
+        <w:t>В этом файле разработан простой макет Mind Deep Relax. Используются виджеты ListView, ClipRRect, Column, Text, ElevatedButton.icon, Row, Container, Icon, IconButton и Image.asset.</w:t>
       </w:r>
     </w:p>
     <w:p>
@@ -823,7 +823,7 @@
           <w:i w:val="0"/>
           <w:sz w:val="28"/>
         </w:rPr>
-        <w:t>В этом файле разработан сложный макет Meditate. Используются виджеты StatefulWidget, ListView, ChoiceChip, Row, Expanded, CustomPaint, Icon и Text. Выбранная категория хранится в состоянии экрана.</w:t>
+        <w:t>В этом файле разработан сложный макет Meditate. Используются виджеты StatefulWidget, ListView, ChoiceChip, Row, Expanded, Image.asset, Icon и Text. Выбранная категория хранится в состоянии экрана.</w:t>
       </w:r>
     </w:p>
     <w:p>
@@ -921,7 +921,7 @@
           <w:i w:val="0"/>
           <w:sz w:val="28"/>
         </w:rPr>
-        <w:t>В этом файле разработан сложный макет Secrets of Atlantis. Используются виджеты Stack, Positioned, CircleAvatar, OutlinedButton, Container, Column, Row, Icon, Text, ListView и MediaQuery.</w:t>
+        <w:t>В этом файле разработан сложный макет Secrets of Atlantis. Используются виджеты Stack, Positioned, Image.asset, CircleAvatar, OutlinedButton, Container, Column, Row, Icon, Text, ListView и MediaQuery.</w:t>
       </w:r>
     </w:p>
     <w:p>

</xml_diff>